<commit_message>
add section and examples on non-form http calls using WEBIFY
</commit_message>
<xml_diff>
--- a/docs/TAZ_BOOK/TAZ_BOOK_latex/resources/pdfs/FrontisMatter.docx
+++ b/docs/TAZ_BOOK/TAZ_BOOK_latex/resources/pdfs/FrontisMatter.docx
@@ -798,7 +798,7 @@
         <w:rPr>
           <w:rFonts w:ascii="Libre Baskerville" w:hAnsi="Libre Baskerville"/>
         </w:rPr>
-        <w:t>monograph</w:t>
+        <w:t>TREATISE</w:t>
       </w:r>
     </w:p>
     <w:p>
@@ -1435,7 +1435,7 @@
           <w:rFonts w:ascii="Libre Baskerville" w:hAnsi="Libre Baskerville"/>
           <w:b/>
         </w:rPr>
-        <w:t>24</w:t>
+        <w:t>30</w:t>
       </w:r>
       <w:r>
         <w:rPr>
@@ -1481,8 +1481,10 @@
           <w:b/>
           <w:color w:val="7030A0"/>
         </w:rPr>
-        <w:t>16 December 2025</w:t>
-      </w:r>
+        <w:t>30 March 2026</w:t>
+      </w:r>
+      <w:bookmarkStart w:id="0" w:name="_GoBack"/>
+      <w:bookmarkEnd w:id="0"/>
     </w:p>
     <w:p/>
     <w:p>
@@ -1495,10 +1497,7 @@
         <w:tab/>
       </w:r>
     </w:p>
-    <w:p>
-      <w:bookmarkStart w:id="0" w:name="_GoBack"/>
-      <w:bookmarkEnd w:id="0"/>
-    </w:p>
+    <w:p/>
     <w:p>
       <w:pPr>
         <w:tabs>

</xml_diff>

<commit_message>
latest TEA TAZ book added too
</commit_message>
<xml_diff>
--- a/docs/TAZ_BOOK/TAZ_BOOK_latex/resources/pdfs/FrontisMatter.docx
+++ b/docs/TAZ_BOOK/TAZ_BOOK_latex/resources/pdfs/FrontisMatter.docx
@@ -423,21 +423,12 @@
           <w:i/>
         </w:rPr>
       </w:pPr>
-      <w:proofErr w:type="spellStart"/>
-      <w:r>
-        <w:rPr>
-          <w:rFonts w:ascii="Libre Baskerville" w:hAnsi="Libre Baskerville"/>
-          <w:i/>
-        </w:rPr>
-        <w:t>Embaga</w:t>
-      </w:r>
-      <w:proofErr w:type="spellEnd"/>
-      <w:r>
-        <w:rPr>
-          <w:rFonts w:ascii="Libre Baskerville" w:hAnsi="Libre Baskerville"/>
-          <w:i/>
-        </w:rPr>
-        <w:t xml:space="preserve"> Ku </w:t>
+      <w:r>
+        <w:rPr>
+          <w:rFonts w:ascii="Libre Baskerville" w:hAnsi="Libre Baskerville"/>
+          <w:i/>
+        </w:rPr>
+        <w:t xml:space="preserve">Embaga Ku </w:t>
       </w:r>
       <w:proofErr w:type="spellStart"/>
       <w:r>
@@ -1481,10 +1472,18 @@
           <w:b/>
           <w:color w:val="7030A0"/>
         </w:rPr>
-        <w:t>30 March 2026</w:t>
+        <w:t>6 May</w:t>
       </w:r>
       <w:bookmarkStart w:id="0" w:name="_GoBack"/>
       <w:bookmarkEnd w:id="0"/>
+      <w:r>
+        <w:rPr>
+          <w:rFonts w:ascii="Libre Baskerville" w:hAnsi="Libre Baskerville"/>
+          <w:b/>
+          <w:color w:val="7030A0"/>
+        </w:rPr>
+        <w:t xml:space="preserve"> 2026</w:t>
+      </w:r>
     </w:p>
     <w:p/>
     <w:p>

</xml_diff>